<commit_message>
Improve CV typography and DPSKW project hierarchy
</commit_message>
<xml_diff>
--- a/cv/Omar_Solanki_CV.docx
+++ b/cv/Omar_Solanki_CV.docx
@@ -11,7 +11,7 @@
           <w:rFonts w:ascii="Aptos" w:hAnsi="Aptos"/>
           <w:b/>
           <w:color w:val="000000"/>
-          <w:sz w:val="40"/>
+          <w:sz w:val="46"/>
         </w:rPr>
         <w:t>Omar Solanki</w:t>
       </w:r>
@@ -75,7 +75,18 @@
     </w:p>
     <w:p>
       <w:pPr>
-        <w:pStyle w:val="Heading2"/>
+        <w:ind w:left="259"/>
+      </w:pPr>
+      <w:r>
+        <w:rPr>
+          <w:b/>
+        </w:rPr>
+        <w:t>Selected assignments at DPSKW</w:t>
+      </w:r>
+    </w:p>
+    <w:p>
+      <w:pPr>
+        <w:pStyle w:val="Heading3"/>
       </w:pPr>
       <w:r>
         <w:t>Department of Legal Advice and Legislation (FATWA) | Dec 2023–Aug 2025</w:t>
@@ -83,7 +94,7 @@
     </w:p>
     <w:p>
       <w:pPr>
-        <w:pStyle w:val="CVBullet"/>
+        <w:pStyle w:val="ProjectBullet"/>
       </w:pPr>
       <w:r>
         <w:t>•  Developed business automation using Blue Prism and Python with Selenium.</w:t>
@@ -91,7 +102,7 @@
     </w:p>
     <w:p>
       <w:pPr>
-        <w:pStyle w:val="CVBullet"/>
+        <w:pStyle w:val="ProjectBullet"/>
       </w:pPr>
       <w:r>
         <w:t>•  Managed a major part of the archiving operation, including its databases and systems.</w:t>
@@ -99,7 +110,7 @@
     </w:p>
     <w:p>
       <w:pPr>
-        <w:pStyle w:val="CVBullet"/>
+        <w:pStyle w:val="ProjectBullet"/>
       </w:pPr>
       <w:r>
         <w:t>•  Monitored and supported the archiving workflow to keep daily operations running smoothly.</w:t>
@@ -107,7 +118,7 @@
     </w:p>
     <w:p>
       <w:pPr>
-        <w:pStyle w:val="Heading2"/>
+        <w:pStyle w:val="Heading3"/>
       </w:pPr>
       <w:r>
         <w:t>DPS Internal Workspace | Aug–Nov 2025</w:t>
@@ -115,7 +126,7 @@
     </w:p>
     <w:p>
       <w:pPr>
-        <w:pStyle w:val="CVBullet"/>
+        <w:pStyle w:val="ProjectBullet"/>
       </w:pPr>
       <w:r>
         <w:t>•  Independently designed and built a full-stack internal workspace application for DPS.</w:t>
@@ -123,7 +134,7 @@
     </w:p>
     <w:p>
       <w:pPr>
-        <w:pStyle w:val="CVBullet"/>
+        <w:pStyle w:val="ProjectBullet"/>
       </w:pPr>
       <w:r>
         <w:t>•  Built a Jira-like platform to support team work and project coordination.</w:t>
@@ -131,7 +142,7 @@
     </w:p>
     <w:p>
       <w:pPr>
-        <w:pStyle w:val="Heading2"/>
+        <w:pStyle w:val="Heading3"/>
       </w:pPr>
       <w:r>
         <w:t>Flowable Workflow Integration | Dec 2025–Apr 2026</w:t>
@@ -139,7 +150,7 @@
     </w:p>
     <w:p>
       <w:pPr>
-        <w:pStyle w:val="CVBullet"/>
+        <w:pStyle w:val="ProjectBullet"/>
       </w:pPr>
       <w:r>
         <w:t>•  Served as the dedicated Flowable resource, responsible for the workflow engine, backend routing, and process flows.</w:t>
@@ -147,7 +158,7 @@
     </w:p>
     <w:p>
       <w:pPr>
-        <w:pStyle w:val="CVBullet"/>
+        <w:pStyle w:val="ProjectBullet"/>
       </w:pPr>
       <w:r>
         <w:t>•  Integrated Flowable workflows with the Liferay user interface and coordinated with the Liferay frontend team.</w:t>
@@ -155,7 +166,7 @@
     </w:p>
     <w:p>
       <w:pPr>
-        <w:pStyle w:val="CVBullet"/>
+        <w:pStyle w:val="ProjectBullet"/>
       </w:pPr>
       <w:r>
         <w:t>•  Worked with the webMethods team on API integration between the workflow engine and connected systems.</w:t>
@@ -163,7 +174,7 @@
     </w:p>
     <w:p>
       <w:pPr>
-        <w:pStyle w:val="Heading2"/>
+        <w:pStyle w:val="Heading3"/>
       </w:pPr>
       <w:r>
         <w:t>Warba Insurance and Reinsurance Company | May 2026–Present</w:t>
@@ -171,7 +182,7 @@
     </w:p>
     <w:p>
       <w:pPr>
-        <w:pStyle w:val="CVBullet"/>
+        <w:pStyle w:val="ProjectBullet"/>
       </w:pPr>
       <w:r>
         <w:t>•  Develop and maintain Selenium automation for two motor lines of business, covering the business workflows and requirements of both lines.</w:t>
@@ -179,15 +190,20 @@
     </w:p>
     <w:p>
       <w:pPr>
-        <w:pStyle w:val="CVBullet"/>
+        <w:pStyle w:val="ProjectBullet"/>
       </w:pPr>
       <w:r>
         <w:t>•  Coordinate with the team to keep automation behavior aligned with databases and related systems across those workflows.</w:t>
       </w:r>
     </w:p>
     <w:p>
+      <w:r>
+        <w:br w:type="page"/>
+      </w:r>
+    </w:p>
+    <w:p>
       <w:pPr>
-        <w:pStyle w:val="Heading2"/>
+        <w:pStyle w:val="Heading1"/>
       </w:pPr>
       <w:r>
         <w:t>Earlier Experience</w:t>
@@ -320,7 +336,7 @@
     </w:p>
     <w:sectPr>
       <w:pgSz w:w="12240" w:h="15840"/>
-      <w:pgMar w:top="691" w:right="1037" w:bottom="648" w:left="1037" w:header="720" w:footer="720" w:gutter="0"/>
+      <w:pgMar w:top="936" w:right="1037" w:bottom="864" w:left="1037" w:header="720" w:footer="720" w:gutter="0"/>
       <w:cols w:space="720"/>
       <w:docGrid w:linePitch="360"/>
     </w:sectPr>
@@ -692,12 +708,12 @@
     <w:qFormat/>
     <w:rsid w:val="00FC693F"/>
     <w:pPr>
-      <w:spacing w:after="60"/>
+      <w:spacing w:after="80" w:line="264" w:lineRule="auto"/>
     </w:pPr>
     <w:rPr>
       <w:rFonts w:ascii="Aptos" w:hAnsi="Aptos"/>
       <w:color w:val="232D3A"/>
-      <w:sz w:val="18"/>
+      <w:sz w:val="22"/>
     </w:rPr>
   </w:style>
   <w:style w:type="paragraph" w:styleId="Header">
@@ -755,7 +771,7 @@
     <w:pPr>
       <w:keepNext/>
       <w:keepLines/>
-      <w:spacing w:before="140" w:after="40"/>
+      <w:spacing w:before="240" w:after="80"/>
       <w:outlineLvl w:val="0"/>
     </w:pPr>
     <w:rPr>
@@ -763,7 +779,7 @@
       <w:b/>
       <w:bCs/>
       <w:color w:val="000000"/>
-      <w:sz w:val="21"/>
+      <w:sz w:val="25"/>
       <w:szCs w:val="28"/>
     </w:rPr>
   </w:style>
@@ -779,7 +795,7 @@
     <w:pPr>
       <w:keepNext/>
       <w:keepLines/>
-      <w:spacing w:before="80" w:after="20"/>
+      <w:spacing w:before="140" w:after="60"/>
       <w:outlineLvl w:val="1"/>
     </w:pPr>
     <w:rPr>
@@ -787,7 +803,7 @@
       <w:b/>
       <w:bCs/>
       <w:color w:val="000000"/>
-      <w:sz w:val="19"/>
+      <w:sz w:val="24"/>
       <w:szCs w:val="26"/>
     </w:rPr>
   </w:style>
@@ -803,14 +819,16 @@
     <w:pPr>
       <w:keepNext/>
       <w:keepLines/>
-      <w:spacing w:before="200" w:after="0"/>
+      <w:spacing w:before="160" w:after="40"/>
+      <w:ind w:left="259"/>
       <w:outlineLvl w:val="2"/>
     </w:pPr>
     <w:rPr>
-      <w:rFonts w:asciiTheme="majorHAnsi" w:eastAsiaTheme="majorEastAsia" w:hAnsiTheme="majorHAnsi" w:cstheme="majorBidi"/>
+      <w:rFonts w:asciiTheme="majorHAnsi" w:eastAsiaTheme="majorEastAsia" w:hAnsiTheme="majorHAnsi" w:cstheme="majorBidi" w:ascii="Aptos" w:hAnsi="Aptos"/>
       <w:b/>
       <w:bCs/>
-      <w:color w:val="4F81BD" w:themeColor="accent1"/>
+      <w:color w:val="000000"/>
+      <w:sz w:val="22"/>
     </w:rPr>
   </w:style>
   <w:style w:type="paragraph" w:styleId="Heading4">
@@ -1041,7 +1059,8 @@
     <w:qFormat/>
     <w:rsid w:val="00FC693F"/>
     <w:pPr>
-      <w:spacing w:after="60" w:line="240" w:lineRule="auto" w:before="0"/>
+      <w:keepNext/>
+      <w:spacing w:after="100" w:line="240" w:lineRule="auto" w:before="0"/>
       <w:contextualSpacing/>
     </w:pPr>
     <w:rPr>
@@ -1050,7 +1069,7 @@
       <w:color w:val="000000"/>
       <w:spacing w:val="5"/>
       <w:kern w:val="28"/>
-      <w:sz w:val="40"/>
+      <w:sz w:val="46"/>
       <w:szCs w:val="52"/>
     </w:rPr>
   </w:style>
@@ -12384,8 +12403,15 @@
     <w:name w:val="CV Bullet"/>
     <w:basedOn w:val="Normal"/>
     <w:pPr>
-      <w:spacing w:after="40"/>
+      <w:spacing w:after="60"/>
       <w:ind w:left="259" w:hanging="144"/>
+    </w:pPr>
+  </w:style>
+  <w:style w:type="paragraph" w:customStyle="1" w:styleId="ProjectBullet">
+    <w:name w:val="Project Bullet"/>
+    <w:basedOn w:val="CVBullet"/>
+    <w:pPr>
+      <w:ind w:left="547" w:hanging="144"/>
     </w:pPr>
   </w:style>
 </w:styles>

</xml_diff>

<commit_message>
Refine website skills and CV project hierarchy
</commit_message>
<xml_diff>
--- a/cv/Omar_Solanki_CV.docx
+++ b/cv/Omar_Solanki_CV.docx
@@ -71,17 +71,6 @@
     <w:p>
       <w:r>
         <w:t>August 2023 – Present  |  Salmiya, Kuwait</w:t>
-      </w:r>
-    </w:p>
-    <w:p>
-      <w:pPr>
-        <w:ind w:left="259"/>
-      </w:pPr>
-      <w:r>
-        <w:rPr>
-          <w:b/>
-        </w:rPr>
-        <w:t>Selected projects</w:t>
       </w:r>
     </w:p>
     <w:p>

</xml_diff>